<commit_message>
Deepen interview transcripts with follow-up probes and examples
Co-Authored-By: Claude Fable 5.1 <noreply@anthropic.com>
Claude-Session: https://claude.ai/code/session_011Z9C2ptByc9jQga6MDruQz
</commit_message>
<xml_diff>
--- a/deliverables/תמלילי_ריאיונות_בינה_מלאכותית_פיזיותרפיסטית_ורוקח.docx
+++ b/deliverables/תמלילי_ריאיונות_בינה_מלאכותית_פיזיותרפיסטית_ורוקח.docx
@@ -786,6 +786,78 @@
     </w:p>
     <w:p>
       <w:pPr>
+        <w:keepNext w:val="false"/>
+        <w:bidi/>
+        <w:spacing w:after="80" w:line="360"/>
+        <w:jc w:val="both"/>
+      </w:pPr>
+      <w:r>
+        <w:rPr>
+          <w:noProof/>
+          <w:rFonts w:ascii="Times New Roman" w:cs="David" w:eastAsia="David" w:hAnsi="Times New Roman"/>
+          <w:b/>
+          <w:bCs/>
+          <w:i w:val="false"/>
+          <w:iCs w:val="false"/>
+          <w:sz w:val="24"/>
+          <w:szCs w:val="24"/>
+          <w:rtl/>
+        </w:rPr>
+        <w:t xml:space="preserve">פיראס: </w:t>
+      </w:r>
+      <w:r>
+        <w:rPr>
+          <w:noProof/>
+          <w:rFonts w:ascii="Times New Roman" w:cs="David" w:eastAsia="David" w:hAnsi="Times New Roman"/>
+          <w:b w:val="false"/>
+          <w:bCs w:val="false"/>
+          <w:i/>
+          <w:iCs/>
+          <w:sz w:val="24"/>
+          <w:szCs w:val="24"/>
+          <w:rtl/>
+        </w:rPr>
+        <w:t xml:space="preserve">אני חושב על מה שאמרת עכשיו, "הכול השתנה חוץ מהדבר המרכזי". אשמח אם תרחיבי קצת.</w:t>
+      </w:r>
+    </w:p>
+    <w:p>
+      <w:pPr>
+        <w:keepNext w:val="false"/>
+        <w:bidi/>
+        <w:spacing w:after="80" w:line="360"/>
+        <w:jc w:val="both"/>
+      </w:pPr>
+      <w:r>
+        <w:rPr>
+          <w:noProof/>
+          <w:rFonts w:ascii="Times New Roman" w:cs="David" w:eastAsia="David" w:hAnsi="Times New Roman"/>
+          <w:b/>
+          <w:bCs/>
+          <w:i w:val="false"/>
+          <w:iCs w:val="false"/>
+          <w:sz w:val="24"/>
+          <w:szCs w:val="24"/>
+          <w:rtl/>
+        </w:rPr>
+        <w:t xml:space="preserve">ש': </w:t>
+      </w:r>
+      <w:r>
+        <w:rPr>
+          <w:noProof/>
+          <w:rFonts w:ascii="Times New Roman" w:cs="David" w:eastAsia="David" w:hAnsi="Times New Roman"/>
+          <w:b w:val="false"/>
+          <w:bCs w:val="false"/>
+          <w:i/>
+          <w:iCs/>
+          <w:sz w:val="24"/>
+          <w:szCs w:val="24"/>
+          <w:rtl/>
+        </w:rPr>
+        <w:t xml:space="preserve">… אני אנסה דרך דוגמה. אישה בת שבעים אחרי שבר בכתף. לפני עשר שנים הייתי יושבת איתה, מזיזה לה את היד, מרגישה איפה הכתף נתקעת, ומלמדת אותה שלושה תרגילים על דף. היום אני יושבת איתה, מזיזה לה את היד, מרגישה איפה הכתף נתקעת, ושולחת לה שלושה תרגילים לטלפון עם סרטון. ההבדל הוא בדף מול הטלפון. ההבדל הוא לא ביד שלי על הכתף שלה. … ומה שמדאיג אותי זה שמי שמסתכל מבחוץ, מההנהלה, רואה את הטלפון ולא רואה את היד. כי את הטלפון אפשר למדוד. כמה תוכניות נשלחו, כמה נפתחו. את היד אי אפשר. ואז מתחילים לחשוב שהעבודה היא הטלפון.</w:t>
+      </w:r>
+    </w:p>
+    <w:p>
+      <w:pPr>
         <w:keepNext/>
         <w:bidi/>
         <w:spacing w:after="60" w:before="240" w:line="360"/>
@@ -952,6 +1024,78 @@
     </w:p>
     <w:p>
       <w:pPr>
+        <w:keepNext w:val="false"/>
+        <w:bidi/>
+        <w:spacing w:after="80" w:line="360"/>
+        <w:jc w:val="both"/>
+      </w:pPr>
+      <w:r>
+        <w:rPr>
+          <w:noProof/>
+          <w:rFonts w:ascii="Times New Roman" w:cs="David" w:eastAsia="David" w:hAnsi="Times New Roman"/>
+          <w:b/>
+          <w:bCs/>
+          <w:i w:val="false"/>
+          <w:iCs w:val="false"/>
+          <w:sz w:val="24"/>
+          <w:szCs w:val="24"/>
+          <w:rtl/>
+        </w:rPr>
+        <w:t xml:space="preserve">פיראס: </w:t>
+      </w:r>
+      <w:r>
+        <w:rPr>
+          <w:noProof/>
+          <w:rFonts w:ascii="Times New Roman" w:cs="David" w:eastAsia="David" w:hAnsi="Times New Roman"/>
+          <w:b w:val="false"/>
+          <w:bCs w:val="false"/>
+          <w:i/>
+          <w:iCs/>
+          <w:sz w:val="24"/>
+          <w:szCs w:val="24"/>
+          <w:rtl/>
+        </w:rPr>
+        <w:t xml:space="preserve">ומה עם ההשלמה האוטומטית בתיק, זו שמציעה אבחנות? זה כלי שאת משתמשת בו?</w:t>
+      </w:r>
+    </w:p>
+    <w:p>
+      <w:pPr>
+        <w:keepNext w:val="false"/>
+        <w:bidi/>
+        <w:spacing w:after="80" w:line="360"/>
+        <w:jc w:val="both"/>
+      </w:pPr>
+      <w:r>
+        <w:rPr>
+          <w:noProof/>
+          <w:rFonts w:ascii="Times New Roman" w:cs="David" w:eastAsia="David" w:hAnsi="Times New Roman"/>
+          <w:b/>
+          <w:bCs/>
+          <w:i w:val="false"/>
+          <w:iCs w:val="false"/>
+          <w:sz w:val="24"/>
+          <w:szCs w:val="24"/>
+          <w:rtl/>
+        </w:rPr>
+        <w:t xml:space="preserve">ש': </w:t>
+      </w:r>
+      <w:r>
+        <w:rPr>
+          <w:noProof/>
+          <w:rFonts w:ascii="Times New Roman" w:cs="David" w:eastAsia="David" w:hAnsi="Times New Roman"/>
+          <w:b w:val="false"/>
+          <w:bCs w:val="false"/>
+          <w:i/>
+          <w:iCs/>
+          <w:sz w:val="24"/>
+          <w:szCs w:val="24"/>
+          <w:rtl/>
+        </w:rPr>
+        <w:t xml:space="preserve">אני משתמשת בו בלי לבחור. הוא פשוט שם. אני מתחילה להקליד "כאב" והוא מציע לי "כאב גב תחתון לא ספציפי", "כאב צוואר", ואני לוחצת. וזה נוח. ואני גם שמה לב שמאז שהוא שם, התיעוד שלי נהיה אחיד יותר. פעם הייתי כותבת "כאב בגב התחתון עם הקרנה לישבן הימני, מחמיר בישיבה". היום אני לוחצת על "כאב גב תחתון לא ספציפי" וממשיכה. … וזה לא אותו דבר. התיעוד הראשון הוא של המטופל הזה. השני הוא של קטגוריה. ואני לא בטוחה שמישהו תכנן שזה יקרה. פשוט כשיש כפתור, לוחצים.</w:t>
+      </w:r>
+    </w:p>
+    <w:p>
+      <w:pPr>
         <w:keepNext/>
         <w:bidi/>
         <w:spacing w:after="60" w:before="240" w:line="360"/>
@@ -1149,6 +1293,78 @@
           <w:szCs w:val="24"/>
           <w:rtl/>
         </w:rPr>
+        <w:t xml:space="preserve">איך הרגשת באותו רגע?</w:t>
+      </w:r>
+    </w:p>
+    <w:p>
+      <w:pPr>
+        <w:keepNext w:val="false"/>
+        <w:bidi/>
+        <w:spacing w:after="80" w:line="360"/>
+        <w:jc w:val="both"/>
+      </w:pPr>
+      <w:r>
+        <w:rPr>
+          <w:noProof/>
+          <w:rFonts w:ascii="Times New Roman" w:cs="David" w:eastAsia="David" w:hAnsi="Times New Roman"/>
+          <w:b/>
+          <w:bCs/>
+          <w:i w:val="false"/>
+          <w:iCs w:val="false"/>
+          <w:sz w:val="24"/>
+          <w:szCs w:val="24"/>
+          <w:rtl/>
+        </w:rPr>
+        <w:t xml:space="preserve">ש': </w:t>
+      </w:r>
+      <w:r>
+        <w:rPr>
+          <w:noProof/>
+          <w:rFonts w:ascii="Times New Roman" w:cs="David" w:eastAsia="David" w:hAnsi="Times New Roman"/>
+          <w:b w:val="false"/>
+          <w:bCs w:val="false"/>
+          <w:i/>
+          <w:iCs/>
+          <w:sz w:val="24"/>
+          <w:szCs w:val="24"/>
+          <w:rtl/>
+        </w:rPr>
+        <w:t xml:space="preserve">שני דברים ביחד. הקלה, כי המטופלת הבינה, וזה כל מה שרציתי. ו… משהו כמו מבוכה. אני המדריכה שלה. אני אמורה ללמד אותה. ופתאום היא מראה לי משהו בסיסי שלא ידעתי. … ואחר כך, בדרך הביתה, חשבתי על כל הפעמים בעשר השנים שלפני כן שמטופל הלך הביתה בלי להבין את הדף, כי לא הייתה לי דרך. כמה כתפיים לא התאוששו כמו שצריך בגלל זה. אי אפשר לדעת. אבל זה ישב לי.</w:t>
+      </w:r>
+    </w:p>
+    <w:p>
+      <w:pPr>
+        <w:keepNext w:val="false"/>
+        <w:bidi/>
+        <w:spacing w:after="80" w:line="360"/>
+        <w:jc w:val="both"/>
+      </w:pPr>
+      <w:r>
+        <w:rPr>
+          <w:noProof/>
+          <w:rFonts w:ascii="Times New Roman" w:cs="David" w:eastAsia="David" w:hAnsi="Times New Roman"/>
+          <w:b/>
+          <w:bCs/>
+          <w:i w:val="false"/>
+          <w:iCs w:val="false"/>
+          <w:sz w:val="24"/>
+          <w:szCs w:val="24"/>
+          <w:rtl/>
+        </w:rPr>
+        <w:t xml:space="preserve">פיראס: </w:t>
+      </w:r>
+      <w:r>
+        <w:rPr>
+          <w:noProof/>
+          <w:rFonts w:ascii="Times New Roman" w:cs="David" w:eastAsia="David" w:hAnsi="Times New Roman"/>
+          <w:b w:val="false"/>
+          <w:bCs w:val="false"/>
+          <w:i/>
+          <w:iCs/>
+          <w:sz w:val="24"/>
+          <w:szCs w:val="24"/>
+          <w:rtl/>
+        </w:rPr>
         <w:t xml:space="preserve">אז זה היה ביוזמה של עמיתה, לא שלך ולא של הקופה.</w:t>
       </w:r>
     </w:p>
@@ -1365,6 +1581,78 @@
           <w:szCs w:val="24"/>
           <w:rtl/>
         </w:rPr>
+        <w:t xml:space="preserve">מה היו שני הדברים שתיקנת?</w:t>
+      </w:r>
+    </w:p>
+    <w:p>
+      <w:pPr>
+        <w:keepNext w:val="false"/>
+        <w:bidi/>
+        <w:spacing w:after="80" w:line="360"/>
+        <w:jc w:val="both"/>
+      </w:pPr>
+      <w:r>
+        <w:rPr>
+          <w:noProof/>
+          <w:rFonts w:ascii="Times New Roman" w:cs="David" w:eastAsia="David" w:hAnsi="Times New Roman"/>
+          <w:b/>
+          <w:bCs/>
+          <w:i w:val="false"/>
+          <w:iCs w:val="false"/>
+          <w:sz w:val="24"/>
+          <w:szCs w:val="24"/>
+          <w:rtl/>
+        </w:rPr>
+        <w:t xml:space="preserve">ש': </w:t>
+      </w:r>
+      <w:r>
+        <w:rPr>
+          <w:noProof/>
+          <w:rFonts w:ascii="Times New Roman" w:cs="David" w:eastAsia="David" w:hAnsi="Times New Roman"/>
+          <w:b w:val="false"/>
+          <w:bCs w:val="false"/>
+          <w:i/>
+          <w:iCs/>
+          <w:sz w:val="24"/>
+          <w:szCs w:val="24"/>
+          <w:rtl/>
+        </w:rPr>
+        <w:t xml:space="preserve">אחד, הוא כתב שהשריר "מייצב את הברך" בצורה שנשמעה כאילו החיזוק לבד מונע פציעה חוזרת, וזה לא מדויק, זה מפחית סיכון, לא מונע. תיקנתי כי אני לא רוצה שמטופל יחשוב שאם הוא עשה תרגילים הוא חסין. שתיים, הוא הוסיף משפט שלא ביקשתי, משהו כמו "התייעץ עם הפיזיותרפיסט שלך לפני כל שינוי". מחקתי, כי אני הפיזיותרפיסטית שלו, וזה נשמע כמו עלון של תרופה. … אבל שימי לב, שניהם תיקוני דיוק וטון. לא תיקוני עובדה גסה. זה בדרך כלל ככה: הוא לא טועה בגדול, הוא מחליק. וההחלקות האלה, מי שלא מהמקצוע לא רואה אותן.</w:t>
+      </w:r>
+    </w:p>
+    <w:p>
+      <w:pPr>
+        <w:keepNext w:val="false"/>
+        <w:bidi/>
+        <w:spacing w:after="80" w:line="360"/>
+        <w:jc w:val="both"/>
+      </w:pPr>
+      <w:r>
+        <w:rPr>
+          <w:noProof/>
+          <w:rFonts w:ascii="Times New Roman" w:cs="David" w:eastAsia="David" w:hAnsi="Times New Roman"/>
+          <w:b/>
+          <w:bCs/>
+          <w:i w:val="false"/>
+          <w:iCs w:val="false"/>
+          <w:sz w:val="24"/>
+          <w:szCs w:val="24"/>
+          <w:rtl/>
+        </w:rPr>
+        <w:t xml:space="preserve">פיראס: </w:t>
+      </w:r>
+      <w:r>
+        <w:rPr>
+          <w:noProof/>
+          <w:rFonts w:ascii="Times New Roman" w:cs="David" w:eastAsia="David" w:hAnsi="Times New Roman"/>
+          <w:b w:val="false"/>
+          <w:bCs w:val="false"/>
+          <w:i/>
+          <w:iCs/>
+          <w:sz w:val="24"/>
+          <w:szCs w:val="24"/>
+          <w:rtl/>
+        </w:rPr>
         <w:t xml:space="preserve">ומקרה שבו הכלי טעה, בלבל, או שלא סמכת עליו?</w:t>
       </w:r>
     </w:p>
@@ -1509,6 +1797,78 @@
           <w:szCs w:val="24"/>
           <w:rtl/>
         </w:rPr>
+        <w:t xml:space="preserve">חשבת על זה פעם אחרת, אחרי אותו מקרה?</w:t>
+      </w:r>
+    </w:p>
+    <w:p>
+      <w:pPr>
+        <w:keepNext w:val="false"/>
+        <w:bidi/>
+        <w:spacing w:after="80" w:line="360"/>
+        <w:jc w:val="both"/>
+      </w:pPr>
+      <w:r>
+        <w:rPr>
+          <w:noProof/>
+          <w:rFonts w:ascii="Times New Roman" w:cs="David" w:eastAsia="David" w:hAnsi="Times New Roman"/>
+          <w:b/>
+          <w:bCs/>
+          <w:i w:val="false"/>
+          <w:iCs w:val="false"/>
+          <w:sz w:val="24"/>
+          <w:szCs w:val="24"/>
+          <w:rtl/>
+        </w:rPr>
+        <w:t xml:space="preserve">ש': </w:t>
+      </w:r>
+      <w:r>
+        <w:rPr>
+          <w:noProof/>
+          <w:rFonts w:ascii="Times New Roman" w:cs="David" w:eastAsia="David" w:hAnsi="Times New Roman"/>
+          <w:b w:val="false"/>
+          <w:bCs w:val="false"/>
+          <w:i/>
+          <w:iCs/>
+          <w:sz w:val="24"/>
+          <w:szCs w:val="24"/>
+          <w:rtl/>
+        </w:rPr>
+        <w:t xml:space="preserve">חשבתי על זה כשראיתי סטודנט עושה בדיוק את מה שאני עשיתי. ביקש רשימת תרגילים, קיבל, והעתיק. ואז הבנתי שהבעיה היא לא הכלי. הכלי טועה כמו שספר יכול לטעות. הבעיה היא שהוא טועה בביטחון, ושמי שאין לו עדיין ידע משלו, אין לו במה לבדוק אותו. … אני, אחרי שלוש עשרה שנה, יש לי במה. הסטודנט, אין לו. ואם הוא ילמד מהכלי במקום מהגוף, יהיה לו פחות ופחות במה. זה המעגל שמפחיד אותי. לא הטעות הבודדת.</w:t>
+      </w:r>
+    </w:p>
+    <w:p>
+      <w:pPr>
+        <w:keepNext w:val="false"/>
+        <w:bidi/>
+        <w:spacing w:after="80" w:line="360"/>
+        <w:jc w:val="both"/>
+      </w:pPr>
+      <w:r>
+        <w:rPr>
+          <w:noProof/>
+          <w:rFonts w:ascii="Times New Roman" w:cs="David" w:eastAsia="David" w:hAnsi="Times New Roman"/>
+          <w:b/>
+          <w:bCs/>
+          <w:i w:val="false"/>
+          <w:iCs w:val="false"/>
+          <w:sz w:val="24"/>
+          <w:szCs w:val="24"/>
+          <w:rtl/>
+        </w:rPr>
+        <w:t xml:space="preserve">פיראס: </w:t>
+      </w:r>
+      <w:r>
+        <w:rPr>
+          <w:noProof/>
+          <w:rFonts w:ascii="Times New Roman" w:cs="David" w:eastAsia="David" w:hAnsi="Times New Roman"/>
+          <w:b w:val="false"/>
+          <w:bCs w:val="false"/>
+          <w:i/>
+          <w:iCs/>
+          <w:sz w:val="24"/>
+          <w:szCs w:val="24"/>
+          <w:rtl/>
+        </w:rPr>
         <w:t xml:space="preserve">אז יש דברים שאת בכוונה לא עושה עם הכלים האלה. תוכלי לפרט?</w:t>
       </w:r>
     </w:p>
@@ -1618,6 +1978,78 @@
           <w:rtl/>
         </w:rPr>
         <w:t xml:space="preserve">… הגבול עובר איפה שהאחריות שלי מתחילה. ניסוח, תרגום, הסבר, זה שירות. החלטה קלינית זה אני. אם הוא מנסח לא טוב, המטופל לא מבין, ואני מתקנת. אם הוא מחליט לא טוב, המטופל נפגע, ואני חתומה. אז אני נותנת לו לעשות רק את הדברים שאם הוא טועה בהם, אני רואה את זה לפני שזה מגיע לגוף של מישהו.</w:t>
+      </w:r>
+    </w:p>
+    <w:p>
+      <w:pPr>
+        <w:keepNext w:val="false"/>
+        <w:bidi/>
+        <w:spacing w:after="80" w:line="360"/>
+        <w:jc w:val="both"/>
+      </w:pPr>
+      <w:r>
+        <w:rPr>
+          <w:noProof/>
+          <w:rFonts w:ascii="Times New Roman" w:cs="David" w:eastAsia="David" w:hAnsi="Times New Roman"/>
+          <w:b/>
+          <w:bCs/>
+          <w:i w:val="false"/>
+          <w:iCs w:val="false"/>
+          <w:sz w:val="24"/>
+          <w:szCs w:val="24"/>
+          <w:rtl/>
+        </w:rPr>
+        <w:t xml:space="preserve">פיראס: </w:t>
+      </w:r>
+      <w:r>
+        <w:rPr>
+          <w:noProof/>
+          <w:rFonts w:ascii="Times New Roman" w:cs="David" w:eastAsia="David" w:hAnsi="Times New Roman"/>
+          <w:b w:val="false"/>
+          <w:bCs w:val="false"/>
+          <w:i/>
+          <w:iCs/>
+          <w:sz w:val="24"/>
+          <w:szCs w:val="24"/>
+          <w:rtl/>
+        </w:rPr>
+        <w:t xml:space="preserve">ויש גבול שאת לא בטוחה לגביו? משהו באזור האפור?</w:t>
+      </w:r>
+    </w:p>
+    <w:p>
+      <w:pPr>
+        <w:keepNext w:val="false"/>
+        <w:bidi/>
+        <w:spacing w:after="80" w:line="360"/>
+        <w:jc w:val="both"/>
+      </w:pPr>
+      <w:r>
+        <w:rPr>
+          <w:noProof/>
+          <w:rFonts w:ascii="Times New Roman" w:cs="David" w:eastAsia="David" w:hAnsi="Times New Roman"/>
+          <w:b/>
+          <w:bCs/>
+          <w:i w:val="false"/>
+          <w:iCs w:val="false"/>
+          <w:sz w:val="24"/>
+          <w:szCs w:val="24"/>
+          <w:rtl/>
+        </w:rPr>
+        <w:t xml:space="preserve">ש': </w:t>
+      </w:r>
+      <w:r>
+        <w:rPr>
+          <w:noProof/>
+          <w:rFonts w:ascii="Times New Roman" w:cs="David" w:eastAsia="David" w:hAnsi="Times New Roman"/>
+          <w:b w:val="false"/>
+          <w:bCs w:val="false"/>
+          <w:i/>
+          <w:iCs/>
+          <w:sz w:val="24"/>
+          <w:szCs w:val="24"/>
+          <w:rtl/>
+        </w:rPr>
+        <w:t xml:space="preserve">… כן. סיכומים של מאמרים. לפעמים אני רוצה לדעת מה אומר מחקר חדש על פרוטוקול מסוים, ואין לי זמן לקרוא עשרים עמודים, אז אני מבקשת סיכום. וזה כבר תוכן קליני, במובן מסוים. אני אומרת לעצמי שזה בסדר כי אני קוראת את הסיכום בעיניים ביקורתיות. אבל אני לא באמת יודעת מה הוא השמיט. … אז זה אפור. אני עושה את זה, ואני לא שלמה עם זה, ואני לא עושה את זה לפני שאני משנה משהו בטיפול. רק בשביל להתמצא.</w:t>
       </w:r>
     </w:p>
     <w:p>
@@ -2107,6 +2539,78 @@
           <w:szCs w:val="24"/>
           <w:rtl/>
         </w:rPr>
+        <w:t xml:space="preserve">מה את עושה עם זה, בהדרכה?</w:t>
+      </w:r>
+    </w:p>
+    <w:p>
+      <w:pPr>
+        <w:keepNext w:val="false"/>
+        <w:bidi/>
+        <w:spacing w:after="80" w:line="360"/>
+        <w:jc w:val="both"/>
+      </w:pPr>
+      <w:r>
+        <w:rPr>
+          <w:noProof/>
+          <w:rFonts w:ascii="Times New Roman" w:cs="David" w:eastAsia="David" w:hAnsi="Times New Roman"/>
+          <w:b/>
+          <w:bCs/>
+          <w:i w:val="false"/>
+          <w:iCs w:val="false"/>
+          <w:sz w:val="24"/>
+          <w:szCs w:val="24"/>
+          <w:rtl/>
+        </w:rPr>
+        <w:t xml:space="preserve">ש': </w:t>
+      </w:r>
+      <w:r>
+        <w:rPr>
+          <w:noProof/>
+          <w:rFonts w:ascii="Times New Roman" w:cs="David" w:eastAsia="David" w:hAnsi="Times New Roman"/>
+          <w:b w:val="false"/>
+          <w:bCs w:val="false"/>
+          <w:i/>
+          <w:iCs/>
+          <w:sz w:val="24"/>
+          <w:szCs w:val="24"/>
+          <w:rtl/>
+        </w:rPr>
+        <w:t xml:space="preserve">שיניתי את ההדרכה. פעם הייתי מבקשת "תביא תוכנית טיפול". היום אני מבקשת "תביא תוכנית טיפול, ותכתוב ליד כל תרגיל למה הוא ולא אחר". ואם הוא לא יכול לכתוב למה, התרגיל יורד. זה עובד. בהתחלה הם מתלוננים, אחר כך הם מבינים שזה בעצם מה שמבדיל בינם לבין הטלפון. … ואני גם אומרת להם משהו שאני מאמינה בו: הכלי הזה הולך להיות בעבודה שלכם כל החיים. אני לא אלמד אתכם לא להשתמש בו. אני אלמד אתכם לדעת מספיק כדי לתפוס אותו.</w:t>
+      </w:r>
+    </w:p>
+    <w:p>
+      <w:pPr>
+        <w:keepNext w:val="false"/>
+        <w:bidi/>
+        <w:spacing w:after="80" w:line="360"/>
+        <w:jc w:val="both"/>
+      </w:pPr>
+      <w:r>
+        <w:rPr>
+          <w:noProof/>
+          <w:rFonts w:ascii="Times New Roman" w:cs="David" w:eastAsia="David" w:hAnsi="Times New Roman"/>
+          <w:b/>
+          <w:bCs/>
+          <w:i w:val="false"/>
+          <w:iCs w:val="false"/>
+          <w:sz w:val="24"/>
+          <w:szCs w:val="24"/>
+          <w:rtl/>
+        </w:rPr>
+        <w:t xml:space="preserve">פיראס: </w:t>
+      </w:r>
+      <w:r>
+        <w:rPr>
+          <w:noProof/>
+          <w:rFonts w:ascii="Times New Roman" w:cs="David" w:eastAsia="David" w:hAnsi="Times New Roman"/>
+          <w:b w:val="false"/>
+          <w:bCs w:val="false"/>
+          <w:i/>
+          <w:iCs/>
+          <w:sz w:val="24"/>
+          <w:szCs w:val="24"/>
+          <w:rtl/>
+        </w:rPr>
         <w:t xml:space="preserve">יש לך חשש שהטכנולוגיה תחליף חלק מהעבודה שלך, או תשנה את מעמד המקצוע?</w:t>
       </w:r>
     </w:p>
@@ -2144,6 +2648,78 @@
           <w:rtl/>
         </w:rPr>
         <w:t xml:space="preserve">את הידיים, לא. אין אפליקציה שמגייסת שריר רדום בכתף של אישה בת שבעים. אבל אני כן חוששת ממשהו אחר, פחות דרמטי ויותר סביר. שהקופה תחליט שחלק מהטיפולים אפשר לעשות מרחוק, עם אפליקציה וסרטונים, ושאני אראה מטופל פעם בשלושה שבועות במקום פעם בשבוע, כי "יש לו תוכנית בטלפון". זה לא יחליף אותי. זה ידלל אותי. וזה כבר קורה קצת, בשקט. יש לנו מטופלים שמקבלים "ליווי דיגיטלי" במקום סדרת טיפולים, ואני לא בטוחה שמישהו בדק אם זה עובד.</w:t>
+      </w:r>
+    </w:p>
+    <w:p>
+      <w:pPr>
+        <w:keepNext w:val="false"/>
+        <w:bidi/>
+        <w:spacing w:after="80" w:line="360"/>
+        <w:jc w:val="both"/>
+      </w:pPr>
+      <w:r>
+        <w:rPr>
+          <w:noProof/>
+          <w:rFonts w:ascii="Times New Roman" w:cs="David" w:eastAsia="David" w:hAnsi="Times New Roman"/>
+          <w:b/>
+          <w:bCs/>
+          <w:i w:val="false"/>
+          <w:iCs w:val="false"/>
+          <w:sz w:val="24"/>
+          <w:szCs w:val="24"/>
+          <w:rtl/>
+        </w:rPr>
+        <w:t xml:space="preserve">פיראס: </w:t>
+      </w:r>
+      <w:r>
+        <w:rPr>
+          <w:noProof/>
+          <w:rFonts w:ascii="Times New Roman" w:cs="David" w:eastAsia="David" w:hAnsi="Times New Roman"/>
+          <w:b w:val="false"/>
+          <w:bCs w:val="false"/>
+          <w:i/>
+          <w:iCs/>
+          <w:sz w:val="24"/>
+          <w:szCs w:val="24"/>
+          <w:rtl/>
+        </w:rPr>
+        <w:t xml:space="preserve">תוכלי לתת דוגמה למטופל כזה?</w:t>
+      </w:r>
+    </w:p>
+    <w:p>
+      <w:pPr>
+        <w:keepNext w:val="false"/>
+        <w:bidi/>
+        <w:spacing w:after="80" w:line="360"/>
+        <w:jc w:val="both"/>
+      </w:pPr>
+      <w:r>
+        <w:rPr>
+          <w:noProof/>
+          <w:rFonts w:ascii="Times New Roman" w:cs="David" w:eastAsia="David" w:hAnsi="Times New Roman"/>
+          <w:b/>
+          <w:bCs/>
+          <w:i w:val="false"/>
+          <w:iCs w:val="false"/>
+          <w:sz w:val="24"/>
+          <w:szCs w:val="24"/>
+          <w:rtl/>
+        </w:rPr>
+        <w:t xml:space="preserve">ש': </w:t>
+      </w:r>
+      <w:r>
+        <w:rPr>
+          <w:noProof/>
+          <w:rFonts w:ascii="Times New Roman" w:cs="David" w:eastAsia="David" w:hAnsi="Times New Roman"/>
+          <w:b w:val="false"/>
+          <w:bCs w:val="false"/>
+          <w:i/>
+          <w:iCs/>
+          <w:sz w:val="24"/>
+          <w:szCs w:val="24"/>
+          <w:rtl/>
+        </w:rPr>
+        <w:t xml:space="preserve">גבר בן שישים וחמש, אחרי החלפת ברך. בעבר היה מקבל שתים עשרה טיפולים. היום הוא קיבל ארבעה, ואפליקציה, ושיחת וידאו אחת. והוא הגיע אליי בטיפול הרביעי עם ברך שלא מתיישרת עד הסוף, כי בסרטון לא רואים שהוא מרמה בתרגיל, והוא רימה שלושה שבועות בלי לדעת. אם היה בא כל שבוע, הייתי רואה את זה בשבוע הראשון. … אז עכשיו צריך יותר טיפולים כדי לתקן. והאפליקציה הראתה "ביצע מאה אחוז מהתרגילים". היא לא יודעת לראות רמאות. אני יודעת.</w:t>
       </w:r>
     </w:p>
     <w:p>
@@ -2417,6 +2993,78 @@
           <w:szCs w:val="24"/>
           <w:rtl/>
         </w:rPr>
+        <w:t xml:space="preserve">אז מה שאת בעצם אומרת זה שיש פער בין מה שהקופה חושבת שקורה לבין מה שקורה?</w:t>
+      </w:r>
+    </w:p>
+    <w:p>
+      <w:pPr>
+        <w:keepNext w:val="false"/>
+        <w:bidi/>
+        <w:spacing w:after="80" w:line="360"/>
+        <w:jc w:val="both"/>
+      </w:pPr>
+      <w:r>
+        <w:rPr>
+          <w:noProof/>
+          <w:rFonts w:ascii="Times New Roman" w:cs="David" w:eastAsia="David" w:hAnsi="Times New Roman"/>
+          <w:b/>
+          <w:bCs/>
+          <w:i w:val="false"/>
+          <w:iCs w:val="false"/>
+          <w:sz w:val="24"/>
+          <w:szCs w:val="24"/>
+          <w:rtl/>
+        </w:rPr>
+        <w:t xml:space="preserve">ש': </w:t>
+      </w:r>
+      <w:r>
+        <w:rPr>
+          <w:noProof/>
+          <w:rFonts w:ascii="Times New Roman" w:cs="David" w:eastAsia="David" w:hAnsi="Times New Roman"/>
+          <w:b w:val="false"/>
+          <w:bCs w:val="false"/>
+          <w:i/>
+          <w:iCs/>
+          <w:sz w:val="24"/>
+          <w:szCs w:val="24"/>
+          <w:rtl/>
+        </w:rPr>
+        <w:t xml:space="preserve">יותר מפער. יש שני עולמות. בעולם של הקופה, אנשי המקצוע לא משתמשים בכלים חיצוניים, כי זה חסום ויש חוזר. בעולם שלי, כולם משתמשים, מהטלפון, כל יום. ואין נקודת מפגש. … ואני אגיד משהו קצת קשה. הנוחות של המצב הזה היא לשני הצדדים. הקופה לא צריכה לקחת אחריות, כי "אסור". ואנחנו לא צריכים לדווח, כי "לא קורה". כולם מרוצים, עד שמשהו ישתבש.</w:t>
+      </w:r>
+    </w:p>
+    <w:p>
+      <w:pPr>
+        <w:keepNext w:val="false"/>
+        <w:bidi/>
+        <w:spacing w:after="80" w:line="360"/>
+        <w:jc w:val="both"/>
+      </w:pPr>
+      <w:r>
+        <w:rPr>
+          <w:noProof/>
+          <w:rFonts w:ascii="Times New Roman" w:cs="David" w:eastAsia="David" w:hAnsi="Times New Roman"/>
+          <w:b/>
+          <w:bCs/>
+          <w:i w:val="false"/>
+          <w:iCs w:val="false"/>
+          <w:sz w:val="24"/>
+          <w:szCs w:val="24"/>
+          <w:rtl/>
+        </w:rPr>
+        <w:t xml:space="preserve">פיראס: </w:t>
+      </w:r>
+      <w:r>
+        <w:rPr>
+          <w:noProof/>
+          <w:rFonts w:ascii="Times New Roman" w:cs="David" w:eastAsia="David" w:hAnsi="Times New Roman"/>
+          <w:b w:val="false"/>
+          <w:bCs w:val="false"/>
+          <w:i/>
+          <w:iCs/>
+          <w:sz w:val="24"/>
+          <w:szCs w:val="24"/>
+          <w:rtl/>
+        </w:rPr>
         <w:t xml:space="preserve">מה ידוע לך על הכללים לגבי שימוש בכלים חיצוניים ופרטיות מידע של מטופלים?</w:t>
       </w:r>
     </w:p>
@@ -2871,6 +3519,78 @@
           <w:szCs w:val="24"/>
           <w:rtl/>
         </w:rPr>
+        <w:t xml:space="preserve">ומה לא היית עושה?</w:t>
+      </w:r>
+    </w:p>
+    <w:p>
+      <w:pPr>
+        <w:keepNext w:val="false"/>
+        <w:bidi/>
+        <w:spacing w:after="80" w:line="360"/>
+        <w:jc w:val="both"/>
+      </w:pPr>
+      <w:r>
+        <w:rPr>
+          <w:noProof/>
+          <w:rFonts w:ascii="Times New Roman" w:cs="David" w:eastAsia="David" w:hAnsi="Times New Roman"/>
+          <w:b/>
+          <w:bCs/>
+          <w:i w:val="false"/>
+          <w:iCs w:val="false"/>
+          <w:sz w:val="24"/>
+          <w:szCs w:val="24"/>
+          <w:rtl/>
+        </w:rPr>
+        <w:t xml:space="preserve">ש': </w:t>
+      </w:r>
+      <w:r>
+        <w:rPr>
+          <w:noProof/>
+          <w:rFonts w:ascii="Times New Roman" w:cs="David" w:eastAsia="David" w:hAnsi="Times New Roman"/>
+          <w:b w:val="false"/>
+          <w:bCs w:val="false"/>
+          <w:i/>
+          <w:iCs/>
+          <w:sz w:val="24"/>
+          <w:szCs w:val="24"/>
+          <w:rtl/>
+        </w:rPr>
+        <w:t xml:space="preserve">לא הייתי אוסרת. אני חושבת שהאיסור הוא מה שהביא אותנו למצב הזה. ולא הייתי מכניסה כלי שמציע לי תוכנית טיפול. גם אם הוא יהיה טוב. כי ברגע שיש הצעה על המסך, הדרך הקלה היא ללחוץ, ואני ראיתי מה זה עושה לתיעוד עם ההשלמה האוטומטית. … אם הכלי מציע, בסוף הוא מחליט. גם אם על הנייר אני מחליטה.</w:t>
+      </w:r>
+    </w:p>
+    <w:p>
+      <w:pPr>
+        <w:keepNext w:val="false"/>
+        <w:bidi/>
+        <w:spacing w:after="80" w:line="360"/>
+        <w:jc w:val="both"/>
+      </w:pPr>
+      <w:r>
+        <w:rPr>
+          <w:noProof/>
+          <w:rFonts w:ascii="Times New Roman" w:cs="David" w:eastAsia="David" w:hAnsi="Times New Roman"/>
+          <w:b/>
+          <w:bCs/>
+          <w:i w:val="false"/>
+          <w:iCs w:val="false"/>
+          <w:sz w:val="24"/>
+          <w:szCs w:val="24"/>
+          <w:rtl/>
+        </w:rPr>
+        <w:t xml:space="preserve">פיראס: </w:t>
+      </w:r>
+      <w:r>
+        <w:rPr>
+          <w:noProof/>
+          <w:rFonts w:ascii="Times New Roman" w:cs="David" w:eastAsia="David" w:hAnsi="Times New Roman"/>
+          <w:b w:val="false"/>
+          <w:bCs w:val="false"/>
+          <w:i/>
+          <w:iCs/>
+          <w:sz w:val="24"/>
+          <w:szCs w:val="24"/>
+          <w:rtl/>
+        </w:rPr>
         <w:t xml:space="preserve">יש משהו שלא שאלתי ושחשוב לך להוסיף?</w:t>
       </w:r>
     </w:p>
@@ -3972,7 +4692,79 @@
           <w:szCs w:val="24"/>
           <w:rtl/>
         </w:rPr>
-        <w:t xml:space="preserve">בשנה האחרונה המערכת התחילה להציע לי "המלצות". לא רק להתריע שיש בעיה, אלא להציע חלופה. "שקול להחליף ל-X". זה כבר לא התרעה, זה ייעוץ. ואף אחד לא הסביר לי מאיפה זה בא, מי כתב את הכלל, אם זה רוקח או אלגוריתם. אני לוחץ "ראיתי" ומנפק. … וחוץ מהמערכת, יש ChatGPT, שאני משתמש בו, ויש מה שהצוות עושה בטלפון, שאני לא תמיד יודע. נגיע.</w:t>
+        <w:t xml:space="preserve">בשנה האחרונה המערכת התחילה להציע לי "המלצות". לא רק להתריע שיש בעיה, אלא להציע חלופה. "שקול להחליף ל-X". זה כבר לא התרעה, זה ייעוץ. ואף אחד לא הסביר לי מאיפה זה בא, מי כתב את הכלל, אם זה רוקח או אלגוריתם. אני לוחץ "ראיתי" ומנפק.</w:t>
+      </w:r>
+    </w:p>
+    <w:p>
+      <w:pPr>
+        <w:keepNext w:val="false"/>
+        <w:bidi/>
+        <w:spacing w:after="80" w:line="360"/>
+        <w:jc w:val="both"/>
+      </w:pPr>
+      <w:r>
+        <w:rPr>
+          <w:noProof/>
+          <w:rFonts w:ascii="Times New Roman" w:cs="David" w:eastAsia="David" w:hAnsi="Times New Roman"/>
+          <w:b/>
+          <w:bCs/>
+          <w:i w:val="false"/>
+          <w:iCs w:val="false"/>
+          <w:sz w:val="24"/>
+          <w:szCs w:val="24"/>
+          <w:rtl/>
+        </w:rPr>
+        <w:t xml:space="preserve">נסרין: </w:t>
+      </w:r>
+      <w:r>
+        <w:rPr>
+          <w:noProof/>
+          <w:rFonts w:ascii="Times New Roman" w:cs="David" w:eastAsia="David" w:hAnsi="Times New Roman"/>
+          <w:b w:val="false"/>
+          <w:bCs w:val="false"/>
+          <w:i/>
+          <w:iCs/>
+          <w:sz w:val="24"/>
+          <w:szCs w:val="24"/>
+          <w:rtl/>
+        </w:rPr>
+        <w:t xml:space="preserve">תוכל לתת דוגמה להמלצה כזאת?</w:t>
+      </w:r>
+    </w:p>
+    <w:p>
+      <w:pPr>
+        <w:keepNext w:val="false"/>
+        <w:bidi/>
+        <w:spacing w:after="80" w:line="360"/>
+        <w:jc w:val="both"/>
+      </w:pPr>
+      <w:r>
+        <w:rPr>
+          <w:noProof/>
+          <w:rFonts w:ascii="Times New Roman" w:cs="David" w:eastAsia="David" w:hAnsi="Times New Roman"/>
+          <w:b/>
+          <w:bCs/>
+          <w:i w:val="false"/>
+          <w:iCs w:val="false"/>
+          <w:sz w:val="24"/>
+          <w:szCs w:val="24"/>
+          <w:rtl/>
+        </w:rPr>
+        <w:t xml:space="preserve">ר': </w:t>
+      </w:r>
+      <w:r>
+        <w:rPr>
+          <w:noProof/>
+          <w:rFonts w:ascii="Times New Roman" w:cs="David" w:eastAsia="David" w:hAnsi="Times New Roman"/>
+          <w:b w:val="false"/>
+          <w:bCs w:val="false"/>
+          <w:i/>
+          <w:iCs/>
+          <w:sz w:val="24"/>
+          <w:szCs w:val="24"/>
+          <w:rtl/>
+        </w:rPr>
+        <w:t xml:space="preserve">כן, מהשבוע. מרשם לתרופה ללחץ דם, מינון רגיל, והמערכת הציעה "שקול חלופה מאותה קבוצה, זמינה במלאי". ואני הסתכלתי על זה ולא הבנתי. זה בגלל מלאי? בגלל מחיר? בגלל שיש משהו קליני? לא היה כתוב. … ואז אני צריך להחליט בשתי שניות אם להתקשר לרופא על משהו שאני לא יודע מה הוא. לא התקשרתי. נתתי את מה שנרשם. ואם זה היה קליני, פספסתי. ואם זה היה מלאי, הרי שהמערכת הכניסה לי שיקול של כסף לתוך מסך שאמור להיות על בטיחות. לא יודע איזה משני הדברים גרוע יותר. … וחוץ מהמערכת, יש ChatGPT, שאני משתמש בו, ויש מה שהצוות עושה בטלפון, שאני לא תמיד יודע. נגיע.</w:t>
       </w:r>
     </w:p>
     <w:p>
@@ -4232,7 +5024,7 @@
           <w:szCs w:val="24"/>
           <w:rtl/>
         </w:rPr>
-        <w:t xml:space="preserve">… חלונות. החלונות שקופצים. ארבעים ביום, אולי יותר. "אינטראקציה בינונית", "מינון חורג", "כפילות טיפולית". ואני אגיד לך משהו שרוקחים לא אוהבים להגיד בקול: רוב החלונות אני סוגר בלי לקרוא. לא כי אני רשלן. כי אם אקרא כל אחד, התור יגיע לרחוב. המערכת צועקת על הכול באותו קול, ואז כשהיא צועקת על משהו אמיתי, זה נשמע אותו דבר. … זה הדבר הראשון שעולה לי. לא ChatGPT. העייפות מההתרעות.</w:t>
+        <w:t xml:space="preserve">… חלונות. החלונות שקופצים. ארבעים ביום, אולי יותר. "אינטראקציה בינונית", "מינון חורג", "כפילות טיפולית". ואני אגיד לך משהו שרוקחים לא אוהבים להגיד בקול: רוב החלונות אני סוגר בלי לקרוא. לא כי אני רשלן. כי אם אקרא כל אחד, התור יגיע לרחוב.</w:t>
       </w:r>
     </w:p>
     <w:p>
@@ -4268,6 +5060,78 @@
           <w:szCs w:val="24"/>
           <w:rtl/>
         </w:rPr>
+        <w:t xml:space="preserve">אתה זוכר מתי התחלת לסגור בלי לקרוא?</w:t>
+      </w:r>
+    </w:p>
+    <w:p>
+      <w:pPr>
+        <w:keepNext w:val="false"/>
+        <w:bidi/>
+        <w:spacing w:after="80" w:line="360"/>
+        <w:jc w:val="both"/>
+      </w:pPr>
+      <w:r>
+        <w:rPr>
+          <w:noProof/>
+          <w:rFonts w:ascii="Times New Roman" w:cs="David" w:eastAsia="David" w:hAnsi="Times New Roman"/>
+          <w:b/>
+          <w:bCs/>
+          <w:i w:val="false"/>
+          <w:iCs w:val="false"/>
+          <w:sz w:val="24"/>
+          <w:szCs w:val="24"/>
+          <w:rtl/>
+        </w:rPr>
+        <w:t xml:space="preserve">ר': </w:t>
+      </w:r>
+      <w:r>
+        <w:rPr>
+          <w:noProof/>
+          <w:rFonts w:ascii="Times New Roman" w:cs="David" w:eastAsia="David" w:hAnsi="Times New Roman"/>
+          <w:b w:val="false"/>
+          <w:bCs w:val="false"/>
+          <w:i/>
+          <w:iCs/>
+          <w:sz w:val="24"/>
+          <w:szCs w:val="24"/>
+          <w:rtl/>
+        </w:rPr>
+        <w:t xml:space="preserve">… לא רגע אחד. זה זוחל. בהתחלה קראתי הכול. אחר כך למדתי שחלון מסוים, "כפילות טיפולית" על שתי משחות, זה תמיד שטויות, ואת זה סגרתי. אחר כך "אינטראקציה קלה", שזה תמיד קפה עם משהו. ואז יום אחד שמתי לב שהיד שלי סוגרת לפני שהעין קוראת. … וזה הדבר שאף אחד שתכנן את המערכת לא רואה. הם רואים "הרוקח קיבל התרעה". הם לא רואים שהרוקח קיבל אלף התרעות והפסיק לראות אותן. המערכת צועקת על הכול באותו קול, ואז כשהיא צועקת על משהו אמיתי, זה נשמע אותו דבר. … זה הדבר הראשון שעולה לי. לא ChatGPT. העייפות מההתרעות.</w:t>
+      </w:r>
+    </w:p>
+    <w:p>
+      <w:pPr>
+        <w:keepNext w:val="false"/>
+        <w:bidi/>
+        <w:spacing w:after="80" w:line="360"/>
+        <w:jc w:val="both"/>
+      </w:pPr>
+      <w:r>
+        <w:rPr>
+          <w:noProof/>
+          <w:rFonts w:ascii="Times New Roman" w:cs="David" w:eastAsia="David" w:hAnsi="Times New Roman"/>
+          <w:b/>
+          <w:bCs/>
+          <w:i w:val="false"/>
+          <w:iCs w:val="false"/>
+          <w:sz w:val="24"/>
+          <w:szCs w:val="24"/>
+          <w:rtl/>
+        </w:rPr>
+        <w:t xml:space="preserve">נסרין: </w:t>
+      </w:r>
+      <w:r>
+        <w:rPr>
+          <w:noProof/>
+          <w:rFonts w:ascii="Times New Roman" w:cs="David" w:eastAsia="David" w:hAnsi="Times New Roman"/>
+          <w:b w:val="false"/>
+          <w:bCs w:val="false"/>
+          <w:i/>
+          <w:iCs/>
+          <w:sz w:val="24"/>
+          <w:szCs w:val="24"/>
+          <w:rtl/>
+        </w:rPr>
         <w:t xml:space="preserve">אתה זוכר את הפעם הראשונה שהשתמשת בכלי כמו ChatGPT בהקשר של העבודה?</w:t>
       </w:r>
     </w:p>
@@ -4484,6 +5348,78 @@
           <w:szCs w:val="24"/>
           <w:rtl/>
         </w:rPr>
+        <w:t xml:space="preserve">ואיך הרגשת אחרי שהתקשרת למומחה?</w:t>
+      </w:r>
+    </w:p>
+    <w:p>
+      <w:pPr>
+        <w:keepNext w:val="false"/>
+        <w:bidi/>
+        <w:spacing w:after="80" w:line="360"/>
+        <w:jc w:val="both"/>
+      </w:pPr>
+      <w:r>
+        <w:rPr>
+          <w:noProof/>
+          <w:rFonts w:ascii="Times New Roman" w:cs="David" w:eastAsia="David" w:hAnsi="Times New Roman"/>
+          <w:b/>
+          <w:bCs/>
+          <w:i w:val="false"/>
+          <w:iCs w:val="false"/>
+          <w:sz w:val="24"/>
+          <w:szCs w:val="24"/>
+          <w:rtl/>
+        </w:rPr>
+        <w:t xml:space="preserve">ר': </w:t>
+      </w:r>
+      <w:r>
+        <w:rPr>
+          <w:noProof/>
+          <w:rFonts w:ascii="Times New Roman" w:cs="David" w:eastAsia="David" w:hAnsi="Times New Roman"/>
+          <w:b w:val="false"/>
+          <w:bCs w:val="false"/>
+          <w:i/>
+          <w:iCs/>
+          <w:sz w:val="24"/>
+          <w:szCs w:val="24"/>
+          <w:rtl/>
+        </w:rPr>
+        <w:t xml:space="preserve">… טוב ורע. טוב, כי תפסתי. רע, כי הבנתי כמה קרוב הייתי לא לתפוס. ואני גם זוכר שהמומחה אמר "תודה שהתקשרת", ואמרתי לעצמי שהוא לא יודע כמה פעמים לא התקשרתי. לא כי היה מה להתקשר, אלא כי לא ידעתי אם היה, כי לא קראתי. … זה החור במערכת. היא בנויה על זה שאני קורא, והיא עושה הכול כדי שלא אוכל לקרוא.</w:t>
+      </w:r>
+    </w:p>
+    <w:p>
+      <w:pPr>
+        <w:keepNext w:val="false"/>
+        <w:bidi/>
+        <w:spacing w:after="80" w:line="360"/>
+        <w:jc w:val="both"/>
+      </w:pPr>
+      <w:r>
+        <w:rPr>
+          <w:noProof/>
+          <w:rFonts w:ascii="Times New Roman" w:cs="David" w:eastAsia="David" w:hAnsi="Times New Roman"/>
+          <w:b/>
+          <w:bCs/>
+          <w:i w:val="false"/>
+          <w:iCs w:val="false"/>
+          <w:sz w:val="24"/>
+          <w:szCs w:val="24"/>
+          <w:rtl/>
+        </w:rPr>
+        <w:t xml:space="preserve">נסרין: </w:t>
+      </w:r>
+      <w:r>
+        <w:rPr>
+          <w:noProof/>
+          <w:rFonts w:ascii="Times New Roman" w:cs="David" w:eastAsia="David" w:hAnsi="Times New Roman"/>
+          <w:b w:val="false"/>
+          <w:bCs w:val="false"/>
+          <w:i/>
+          <w:iCs/>
+          <w:sz w:val="24"/>
+          <w:szCs w:val="24"/>
+          <w:rtl/>
+        </w:rPr>
         <w:t xml:space="preserve">ועם ChatGPT?</w:t>
       </w:r>
     </w:p>
@@ -4556,6 +5492,78 @@
           <w:szCs w:val="24"/>
           <w:rtl/>
         </w:rPr>
+        <w:t xml:space="preserve">ולמה לא לסמוך עליו ישר, אם הוא צדק?</w:t>
+      </w:r>
+    </w:p>
+    <w:p>
+      <w:pPr>
+        <w:keepNext w:val="false"/>
+        <w:bidi/>
+        <w:spacing w:after="80" w:line="360"/>
+        <w:jc w:val="both"/>
+      </w:pPr>
+      <w:r>
+        <w:rPr>
+          <w:noProof/>
+          <w:rFonts w:ascii="Times New Roman" w:cs="David" w:eastAsia="David" w:hAnsi="Times New Roman"/>
+          <w:b/>
+          <w:bCs/>
+          <w:i w:val="false"/>
+          <w:iCs w:val="false"/>
+          <w:sz w:val="24"/>
+          <w:szCs w:val="24"/>
+          <w:rtl/>
+        </w:rPr>
+        <w:t xml:space="preserve">ר': </w:t>
+      </w:r>
+      <w:r>
+        <w:rPr>
+          <w:noProof/>
+          <w:rFonts w:ascii="Times New Roman" w:cs="David" w:eastAsia="David" w:hAnsi="Times New Roman"/>
+          <w:b w:val="false"/>
+          <w:bCs w:val="false"/>
+          <w:i/>
+          <w:iCs/>
+          <w:sz w:val="24"/>
+          <w:szCs w:val="24"/>
+          <w:rtl/>
+        </w:rPr>
+        <w:t xml:space="preserve">כי הוא לא תמיד צודק, ואין לו שום סימן שמבדיל בין הפעמים. כשהוא צודק הוא נשמע בדיוק כמו כשהוא טועה. … ויש עוד סיבה, שהיא יותר שלי. אם אני מתחיל לסמוך עליו כשהוא צודק, בפעם הבאה אבדוק פחות. ובפעם אחרי זה עוד פחות. אני מכיר את עצמי. אני מעדיף שהכלל יהיה נוקשה, כי אני לא נוקשה.</w:t>
+      </w:r>
+    </w:p>
+    <w:p>
+      <w:pPr>
+        <w:keepNext w:val="false"/>
+        <w:bidi/>
+        <w:spacing w:after="80" w:line="360"/>
+        <w:jc w:val="both"/>
+      </w:pPr>
+      <w:r>
+        <w:rPr>
+          <w:noProof/>
+          <w:rFonts w:ascii="Times New Roman" w:cs="David" w:eastAsia="David" w:hAnsi="Times New Roman"/>
+          <w:b/>
+          <w:bCs/>
+          <w:i w:val="false"/>
+          <w:iCs w:val="false"/>
+          <w:sz w:val="24"/>
+          <w:szCs w:val="24"/>
+          <w:rtl/>
+        </w:rPr>
+        <w:t xml:space="preserve">נסרין: </w:t>
+      </w:r>
+      <w:r>
+        <w:rPr>
+          <w:noProof/>
+          <w:rFonts w:ascii="Times New Roman" w:cs="David" w:eastAsia="David" w:hAnsi="Times New Roman"/>
+          <w:b w:val="false"/>
+          <w:bCs w:val="false"/>
+          <w:i/>
+          <w:iCs/>
+          <w:sz w:val="24"/>
+          <w:szCs w:val="24"/>
+          <w:rtl/>
+        </w:rPr>
         <w:t xml:space="preserve">ומקרה שבו הכלי טעה, בלבל או שלא סמכת עליו?</w:t>
       </w:r>
     </w:p>
@@ -4700,6 +5708,78 @@
           <w:szCs w:val="24"/>
           <w:rtl/>
         </w:rPr>
+        <w:t xml:space="preserve">סיפרת למישהו על המקרה הזה?</w:t>
+      </w:r>
+    </w:p>
+    <w:p>
+      <w:pPr>
+        <w:keepNext w:val="false"/>
+        <w:bidi/>
+        <w:spacing w:after="80" w:line="360"/>
+        <w:jc w:val="both"/>
+      </w:pPr>
+      <w:r>
+        <w:rPr>
+          <w:noProof/>
+          <w:rFonts w:ascii="Times New Roman" w:cs="David" w:eastAsia="David" w:hAnsi="Times New Roman"/>
+          <w:b/>
+          <w:bCs/>
+          <w:i w:val="false"/>
+          <w:iCs w:val="false"/>
+          <w:sz w:val="24"/>
+          <w:szCs w:val="24"/>
+          <w:rtl/>
+        </w:rPr>
+        <w:t xml:space="preserve">ר': </w:t>
+      </w:r>
+      <w:r>
+        <w:rPr>
+          <w:noProof/>
+          <w:rFonts w:ascii="Times New Roman" w:cs="David" w:eastAsia="David" w:hAnsi="Times New Roman"/>
+          <w:b w:val="false"/>
+          <w:bCs w:val="false"/>
+          <w:i/>
+          <w:iCs/>
+          <w:sz w:val="24"/>
+          <w:szCs w:val="24"/>
+          <w:rtl/>
+        </w:rPr>
+        <w:t xml:space="preserve">לרוקחת הצעירה בצוות, כי רציתי שהיא תדע. לא לרוקח המחוזי. … ושמתי לב עכשיו, כשאת שואלת, שזו הפעם השנייה היום שאני אומר "לא דיווחתי". ואני רוקח אחראי. ואני חושב שזה בגלל שאין למי. אין מסגרת שבה אומרים "כמעט טעיתי בגלל כלי" ומישהו לומד מזה. יש רק מסגרת שבה אומרים "טעיתי" ואז ועדה. אז "כמעט" נשאר אצלי.</w:t>
+      </w:r>
+    </w:p>
+    <w:p>
+      <w:pPr>
+        <w:keepNext w:val="false"/>
+        <w:bidi/>
+        <w:spacing w:after="80" w:line="360"/>
+        <w:jc w:val="both"/>
+      </w:pPr>
+      <w:r>
+        <w:rPr>
+          <w:noProof/>
+          <w:rFonts w:ascii="Times New Roman" w:cs="David" w:eastAsia="David" w:hAnsi="Times New Roman"/>
+          <w:b/>
+          <w:bCs/>
+          <w:i w:val="false"/>
+          <w:iCs w:val="false"/>
+          <w:sz w:val="24"/>
+          <w:szCs w:val="24"/>
+          <w:rtl/>
+        </w:rPr>
+        <w:t xml:space="preserve">נסרין: </w:t>
+      </w:r>
+      <w:r>
+        <w:rPr>
+          <w:noProof/>
+          <w:rFonts w:ascii="Times New Roman" w:cs="David" w:eastAsia="David" w:hAnsi="Times New Roman"/>
+          <w:b w:val="false"/>
+          <w:bCs w:val="false"/>
+          <w:i/>
+          <w:iCs/>
+          <w:sz w:val="24"/>
+          <w:szCs w:val="24"/>
+          <w:rtl/>
+        </w:rPr>
         <w:t xml:space="preserve">אז זה אחד הדברים שאתה בכוונה לא עושה. יש עוד?</w:t>
       </w:r>
     </w:p>
@@ -4737,6 +5817,78 @@
           <w:rtl/>
         </w:rPr>
         <w:t xml:space="preserve">כן. לא מכניס פרטי מטופל, אף פעם. לא שם, לא תעודת זהות, לא "גבר בן שישים עם אי ספיקת כליות". וזה גבול שאני אוכף גם על הצוות, ואני אספר למה כשתשאלי על הצוות. ולא משתמש בו מול מטופל. אם מטופל עומד מולי ואני לא יודע, אני אומר "תן לי דקה" והולך למאגר. לא לטלפון. … ולמה שם הגבול? כי שם האחריות. הסבר בערבית, אם הוא לא מושלם, המטופל שואל שוב. מינון, אם הוא לא מושלם, המטופל בבית חולים. אני לא נותן לכלי לגעת במה שאם הוא טועה, אין דרך חזרה.</w:t>
+      </w:r>
+    </w:p>
+    <w:p>
+      <w:pPr>
+        <w:keepNext w:val="false"/>
+        <w:bidi/>
+        <w:spacing w:after="80" w:line="360"/>
+        <w:jc w:val="both"/>
+      </w:pPr>
+      <w:r>
+        <w:rPr>
+          <w:noProof/>
+          <w:rFonts w:ascii="Times New Roman" w:cs="David" w:eastAsia="David" w:hAnsi="Times New Roman"/>
+          <w:b/>
+          <w:bCs/>
+          <w:i w:val="false"/>
+          <w:iCs w:val="false"/>
+          <w:sz w:val="24"/>
+          <w:szCs w:val="24"/>
+          <w:rtl/>
+        </w:rPr>
+        <w:t xml:space="preserve">נסרין: </w:t>
+      </w:r>
+      <w:r>
+        <w:rPr>
+          <w:noProof/>
+          <w:rFonts w:ascii="Times New Roman" w:cs="David" w:eastAsia="David" w:hAnsi="Times New Roman"/>
+          <w:b w:val="false"/>
+          <w:bCs w:val="false"/>
+          <w:i/>
+          <w:iCs/>
+          <w:sz w:val="24"/>
+          <w:szCs w:val="24"/>
+          <w:rtl/>
+        </w:rPr>
+        <w:t xml:space="preserve">ומה עם המערכת של הקופה? שם אתה נותן לה לגעת במספרים.</w:t>
+      </w:r>
+    </w:p>
+    <w:p>
+      <w:pPr>
+        <w:keepNext w:val="false"/>
+        <w:bidi/>
+        <w:spacing w:after="80" w:line="360"/>
+        <w:jc w:val="both"/>
+      </w:pPr>
+      <w:r>
+        <w:rPr>
+          <w:noProof/>
+          <w:rFonts w:ascii="Times New Roman" w:cs="David" w:eastAsia="David" w:hAnsi="Times New Roman"/>
+          <w:b/>
+          <w:bCs/>
+          <w:i w:val="false"/>
+          <w:iCs w:val="false"/>
+          <w:sz w:val="24"/>
+          <w:szCs w:val="24"/>
+          <w:rtl/>
+        </w:rPr>
+        <w:t xml:space="preserve">ר': </w:t>
+      </w:r>
+      <w:r>
+        <w:rPr>
+          <w:noProof/>
+          <w:rFonts w:ascii="Times New Roman" w:cs="David" w:eastAsia="David" w:hAnsi="Times New Roman"/>
+          <w:b w:val="false"/>
+          <w:bCs w:val="false"/>
+          <w:i/>
+          <w:iCs/>
+          <w:sz w:val="24"/>
+          <w:szCs w:val="24"/>
+          <w:rtl/>
+        </w:rPr>
+        <w:t xml:space="preserve">… זו שאלה טובה, ואני לא בטוח שיש לי תשובה טובה. כן. המערכת בודקת מינונים, ואני סומך עליה בזה. ההבדל, בראש שלי, הוא שמישהו אחראי עליה. יש מאחוריה מאגר, יש ועדה, יש מישהו שאם היא טועה אפשר להרים לו טלפון. מאחורי ChatGPT אין אף אחד. … אבל האמת היא שאני לא יודע מי הוועדה הזאת, ואף פעם לא הרמתי את הטלפון הזה. אז אולי אני סומך על המערכת כי היא של הקופה, לא כי בדקתי. וזה בדיוק מה שאני מאשים בו את הרוקחים הצעירים. [שתיקה ארוכה] טוב. רשמת את זה.</w:t>
       </w:r>
     </w:p>
     <w:p>
@@ -4866,6 +6018,78 @@
           <w:szCs w:val="24"/>
           <w:rtl/>
         </w:rPr>
+        <w:t xml:space="preserve">תוכל לתת דוגמה למשהו שהמחשב לא צועק עליו ואתה כן רואה?</w:t>
+      </w:r>
+    </w:p>
+    <w:p>
+      <w:pPr>
+        <w:keepNext w:val="false"/>
+        <w:bidi/>
+        <w:spacing w:after="80" w:line="360"/>
+        <w:jc w:val="both"/>
+      </w:pPr>
+      <w:r>
+        <w:rPr>
+          <w:noProof/>
+          <w:rFonts w:ascii="Times New Roman" w:cs="David" w:eastAsia="David" w:hAnsi="Times New Roman"/>
+          <w:b/>
+          <w:bCs/>
+          <w:i w:val="false"/>
+          <w:iCs w:val="false"/>
+          <w:sz w:val="24"/>
+          <w:szCs w:val="24"/>
+          <w:rtl/>
+        </w:rPr>
+        <w:t xml:space="preserve">ר': </w:t>
+      </w:r>
+      <w:r>
+        <w:rPr>
+          <w:noProof/>
+          <w:rFonts w:ascii="Times New Roman" w:cs="David" w:eastAsia="David" w:hAnsi="Times New Roman"/>
+          <w:b w:val="false"/>
+          <w:bCs w:val="false"/>
+          <w:i/>
+          <w:iCs/>
+          <w:sz w:val="24"/>
+          <w:szCs w:val="24"/>
+          <w:rtl/>
+        </w:rPr>
+        <w:t xml:space="preserve">מינון שהוא בטווח, אבל לא מתאים לאדם הזה. קשישה בת שמונים ושלוש, ארבעים קילו, מקבלת מינון שהוא "תקין" לפי המערכת, כי המערכת לא יודעת שהיא ארבעים קילו ולא יודעת איך נראית הכליה שלה. המערכת בודקת תרופה מול תרופה. אני בודק תרופה מול אדם. … ורוקח צעיר שלמד שהמערכת בודקת, לא תמיד יודע שיש דבר כזה "מול אדם". לא כי הוא טיפש. כי אף אחד לא הראה לו את מה שהמערכת לא רואה.</w:t>
+      </w:r>
+    </w:p>
+    <w:p>
+      <w:pPr>
+        <w:keepNext w:val="false"/>
+        <w:bidi/>
+        <w:spacing w:after="80" w:line="360"/>
+        <w:jc w:val="both"/>
+      </w:pPr>
+      <w:r>
+        <w:rPr>
+          <w:noProof/>
+          <w:rFonts w:ascii="Times New Roman" w:cs="David" w:eastAsia="David" w:hAnsi="Times New Roman"/>
+          <w:b/>
+          <w:bCs/>
+          <w:i w:val="false"/>
+          <w:iCs w:val="false"/>
+          <w:sz w:val="24"/>
+          <w:szCs w:val="24"/>
+          <w:rtl/>
+        </w:rPr>
+        <w:t xml:space="preserve">נסרין: </w:t>
+      </w:r>
+      <w:r>
+        <w:rPr>
+          <w:noProof/>
+          <w:rFonts w:ascii="Times New Roman" w:cs="David" w:eastAsia="David" w:hAnsi="Times New Roman"/>
+          <w:b w:val="false"/>
+          <w:bCs w:val="false"/>
+          <w:i/>
+          <w:iCs/>
+          <w:sz w:val="24"/>
+          <w:szCs w:val="24"/>
+          <w:rtl/>
+        </w:rPr>
         <w:t xml:space="preserve">יש משימות שנעלמו? שנוספו?</w:t>
       </w:r>
     </w:p>
@@ -5082,6 +6306,78 @@
           <w:szCs w:val="24"/>
           <w:rtl/>
         </w:rPr>
+        <w:t xml:space="preserve">ויש גם צד חיובי בזה שמטופלים באים עם מידע?</w:t>
+      </w:r>
+    </w:p>
+    <w:p>
+      <w:pPr>
+        <w:keepNext w:val="false"/>
+        <w:bidi/>
+        <w:spacing w:after="80" w:line="360"/>
+        <w:jc w:val="both"/>
+      </w:pPr>
+      <w:r>
+        <w:rPr>
+          <w:noProof/>
+          <w:rFonts w:ascii="Times New Roman" w:cs="David" w:eastAsia="David" w:hAnsi="Times New Roman"/>
+          <w:b/>
+          <w:bCs/>
+          <w:i w:val="false"/>
+          <w:iCs w:val="false"/>
+          <w:sz w:val="24"/>
+          <w:szCs w:val="24"/>
+          <w:rtl/>
+        </w:rPr>
+        <w:t xml:space="preserve">ר': </w:t>
+      </w:r>
+      <w:r>
+        <w:rPr>
+          <w:noProof/>
+          <w:rFonts w:ascii="Times New Roman" w:cs="David" w:eastAsia="David" w:hAnsi="Times New Roman"/>
+          <w:b w:val="false"/>
+          <w:bCs w:val="false"/>
+          <w:i/>
+          <w:iCs/>
+          <w:sz w:val="24"/>
+          <w:szCs w:val="24"/>
+          <w:rtl/>
+        </w:rPr>
+        <w:t xml:space="preserve">יש, ואני לא רוצה להישמע כאילו אני רק מתלונן. מטופלים שואלים יותר. פעם לקחו מה שנתתי ולא שאלו כלום, והיו הולכים הביתה ולא לוקחים, ואני לא הייתי יודע. היום הם באים עם שאלות, גם אם השאלות מוזרות, ואפשר לדבר. … ויש מטופלים שבגלל הכלי הבינו לראשונה למה הם לוקחים משהו. רופא אמר להם "קח", הכלי הסביר להם למה, והם מגיעים אליי ואומרים "עכשיו אני מבין". זה דבר טוב. הייתי מעדיף שאני אסביר, אבל אם לא הסברתי, טוב שמישהו הסביר.</w:t>
+      </w:r>
+    </w:p>
+    <w:p>
+      <w:pPr>
+        <w:keepNext w:val="false"/>
+        <w:bidi/>
+        <w:spacing w:after="80" w:line="360"/>
+        <w:jc w:val="both"/>
+      </w:pPr>
+      <w:r>
+        <w:rPr>
+          <w:noProof/>
+          <w:rFonts w:ascii="Times New Roman" w:cs="David" w:eastAsia="David" w:hAnsi="Times New Roman"/>
+          <w:b/>
+          <w:bCs/>
+          <w:i w:val="false"/>
+          <w:iCs w:val="false"/>
+          <w:sz w:val="24"/>
+          <w:szCs w:val="24"/>
+          <w:rtl/>
+        </w:rPr>
+        <w:t xml:space="preserve">נסרין: </w:t>
+      </w:r>
+      <w:r>
+        <w:rPr>
+          <w:noProof/>
+          <w:rFonts w:ascii="Times New Roman" w:cs="David" w:eastAsia="David" w:hAnsi="Times New Roman"/>
+          <w:b w:val="false"/>
+          <w:bCs w:val="false"/>
+          <w:i/>
+          <w:iCs/>
+          <w:sz w:val="24"/>
+          <w:szCs w:val="24"/>
+          <w:rtl/>
+        </w:rPr>
         <w:t xml:space="preserve">אם כלי ממליץ על משהו ואתה פועל לפיו וזה מתברר כטעות, על מי האחריות?</w:t>
       </w:r>
     </w:p>
@@ -5263,6 +6559,78 @@
           <w:rtl/>
         </w:rPr>
         <w:t xml:space="preserve">… יש. ולא מ-ChatGPT. מהקופה. כבר היום יש בקופות דברים שנקראים "ניפוק אוטומטי" ו"רוקח מרחוק". מכונה שמכינה את המרשם, ורוקח אחד שיושב במרכז ומאשר לעשרה סניפים. זה לא עתיד, זה קיים. והמערכת המתריעה היא בדיוק מה שמאפשר את זה, כי אם המחשב בודק, למה צריך רוקח בכל סניף. אז כן, אני חושש שהתפקיד שלי יהפוך למישהו שיושב מול מסך ולוחץ "אישור" על מה שמכונה הכינה ומחשב בדק. וזה כבר לא רוקחות, זה… בקרת איכות.</w:t>
+      </w:r>
+    </w:p>
+    <w:p>
+      <w:pPr>
+        <w:keepNext w:val="false"/>
+        <w:bidi/>
+        <w:spacing w:after="80" w:line="360"/>
+        <w:jc w:val="both"/>
+      </w:pPr>
+      <w:r>
+        <w:rPr>
+          <w:noProof/>
+          <w:rFonts w:ascii="Times New Roman" w:cs="David" w:eastAsia="David" w:hAnsi="Times New Roman"/>
+          <w:b/>
+          <w:bCs/>
+          <w:i w:val="false"/>
+          <w:iCs w:val="false"/>
+          <w:sz w:val="24"/>
+          <w:szCs w:val="24"/>
+          <w:rtl/>
+        </w:rPr>
+        <w:t xml:space="preserve">נסרין: </w:t>
+      </w:r>
+      <w:r>
+        <w:rPr>
+          <w:noProof/>
+          <w:rFonts w:ascii="Times New Roman" w:cs="David" w:eastAsia="David" w:hAnsi="Times New Roman"/>
+          <w:b w:val="false"/>
+          <w:bCs w:val="false"/>
+          <w:i/>
+          <w:iCs/>
+          <w:sz w:val="24"/>
+          <w:szCs w:val="24"/>
+          <w:rtl/>
+        </w:rPr>
+        <w:t xml:space="preserve">מה הולך לאיבוד במעבר הזה, לדעתך?</w:t>
+      </w:r>
+    </w:p>
+    <w:p>
+      <w:pPr>
+        <w:keepNext w:val="false"/>
+        <w:bidi/>
+        <w:spacing w:after="80" w:line="360"/>
+        <w:jc w:val="both"/>
+      </w:pPr>
+      <w:r>
+        <w:rPr>
+          <w:noProof/>
+          <w:rFonts w:ascii="Times New Roman" w:cs="David" w:eastAsia="David" w:hAnsi="Times New Roman"/>
+          <w:b/>
+          <w:bCs/>
+          <w:i w:val="false"/>
+          <w:iCs w:val="false"/>
+          <w:sz w:val="24"/>
+          <w:szCs w:val="24"/>
+          <w:rtl/>
+        </w:rPr>
+        <w:t xml:space="preserve">ר': </w:t>
+      </w:r>
+      <w:r>
+        <w:rPr>
+          <w:noProof/>
+          <w:rFonts w:ascii="Times New Roman" w:cs="David" w:eastAsia="David" w:hAnsi="Times New Roman"/>
+          <w:b w:val="false"/>
+          <w:bCs w:val="false"/>
+          <w:i/>
+          <w:iCs/>
+          <w:sz w:val="24"/>
+          <w:szCs w:val="24"/>
+          <w:rtl/>
+        </w:rPr>
+        <w:t xml:space="preserve">האדם שמולי. אני אתן דוגמה. יש לי מטופל, מבוגר, שבא כל חודש. והוא לא אומר כלום, לוקח את השקית והולך. לפני שנה שמתי לב שהוא מחזיר את אותה תרופה חצי מלאה כל חודש. לא לוקח. ושאלתי, ובסוף יצא שהוא מפחד מתופעת לוואי שקרא עליה. דיברנו, הסברתי, הוא לוקח. … מכונה לא רואה שקית חצי מלאה. רוקח מרחוק לא רואה פנים. ורוקח שרואה מאה וחמישים איש ביום דרך מסך לא ישים לב לאחד שלא מדבר. זה מה שהולך לאיבוד. הדבר שאין לו חלון.</w:t>
       </w:r>
     </w:p>
     <w:p>
@@ -5824,6 +7192,78 @@
           <w:szCs w:val="24"/>
           <w:rtl/>
         </w:rPr>
+        <w:t xml:space="preserve">ניסית פעם להעלות את זה למעלה?</w:t>
+      </w:r>
+    </w:p>
+    <w:p>
+      <w:pPr>
+        <w:keepNext w:val="false"/>
+        <w:bidi/>
+        <w:spacing w:after="80" w:line="360"/>
+        <w:jc w:val="both"/>
+      </w:pPr>
+      <w:r>
+        <w:rPr>
+          <w:noProof/>
+          <w:rFonts w:ascii="Times New Roman" w:cs="David" w:eastAsia="David" w:hAnsi="Times New Roman"/>
+          <w:b/>
+          <w:bCs/>
+          <w:i w:val="false"/>
+          <w:iCs w:val="false"/>
+          <w:sz w:val="24"/>
+          <w:szCs w:val="24"/>
+          <w:rtl/>
+        </w:rPr>
+        <w:t xml:space="preserve">ר': </w:t>
+      </w:r>
+      <w:r>
+        <w:rPr>
+          <w:noProof/>
+          <w:rFonts w:ascii="Times New Roman" w:cs="David" w:eastAsia="David" w:hAnsi="Times New Roman"/>
+          <w:b w:val="false"/>
+          <w:bCs w:val="false"/>
+          <w:i/>
+          <w:iCs/>
+          <w:sz w:val="24"/>
+          <w:szCs w:val="24"/>
+          <w:rtl/>
+        </w:rPr>
+        <w:t xml:space="preserve">פעם אחת. בישיבת רוקחים אחראים, שאלתי אם יש כוונה לאשר כלי כלשהו לניסוח, כי אנחנו ממילא משתמשים. … התגובה הייתה שתיקה, ואז "זה בבדיקה", ואז עברו לנושא הבא. ואחרי הישיבה רוקח אחר ניגש אליי ואמר "למה אמרת שאנחנו משתמשים". וזהו. הבנתי שהנושא הוא לא "איך", הוא "לא להגיד". ואני לא שאלתי שוב.</w:t>
+      </w:r>
+    </w:p>
+    <w:p>
+      <w:pPr>
+        <w:keepNext w:val="false"/>
+        <w:bidi/>
+        <w:spacing w:after="80" w:line="360"/>
+        <w:jc w:val="both"/>
+      </w:pPr>
+      <w:r>
+        <w:rPr>
+          <w:noProof/>
+          <w:rFonts w:ascii="Times New Roman" w:cs="David" w:eastAsia="David" w:hAnsi="Times New Roman"/>
+          <w:b/>
+          <w:bCs/>
+          <w:i w:val="false"/>
+          <w:iCs w:val="false"/>
+          <w:sz w:val="24"/>
+          <w:szCs w:val="24"/>
+          <w:rtl/>
+        </w:rPr>
+        <w:t xml:space="preserve">נסרין: </w:t>
+      </w:r>
+      <w:r>
+        <w:rPr>
+          <w:noProof/>
+          <w:rFonts w:ascii="Times New Roman" w:cs="David" w:eastAsia="David" w:hAnsi="Times New Roman"/>
+          <w:b w:val="false"/>
+          <w:bCs w:val="false"/>
+          <w:i/>
+          <w:iCs/>
+          <w:sz w:val="24"/>
+          <w:szCs w:val="24"/>
+          <w:rtl/>
+        </w:rPr>
         <w:t xml:space="preserve">מה היה עוזר לך להשתמש בכלים האלה בצורה טובה ובטוחה יותר?</w:t>
       </w:r>
     </w:p>
@@ -5955,6 +7395,78 @@
           <w:rtl/>
         </w:rPr>
         <w:t xml:space="preserve">[צוחק] יום אחד זה מעט. אבל בסדר. ראשון, לפתוח כלי אחד מאושר במחשבי הקופה, במקום לחסום, ולהגיד בדיוק מה מותר לעשות בו. שני, להוריד את כמות ההתרעות ולדרג אותן, שאדום יהיה אדום ושצהוב יהיה שקט. שלישי, לפני כל "ניפוק אוטומטי" ו"רוקח מרחוק", לשאול רוקחים מה הולך לאיבוד. לא רק מה נחסך. ורביעי, ליום אחד, לשבת שעה בדלפק בסניף שלי, בין עשר לאחת עשרה, ולראות כמה חלונות קופצים. לפעמים צריך לראות כדי להבין.</w:t>
+      </w:r>
+    </w:p>
+    <w:p>
+      <w:pPr>
+        <w:keepNext w:val="false"/>
+        <w:bidi/>
+        <w:spacing w:after="80" w:line="360"/>
+        <w:jc w:val="both"/>
+      </w:pPr>
+      <w:r>
+        <w:rPr>
+          <w:noProof/>
+          <w:rFonts w:ascii="Times New Roman" w:cs="David" w:eastAsia="David" w:hAnsi="Times New Roman"/>
+          <w:b/>
+          <w:bCs/>
+          <w:i w:val="false"/>
+          <w:iCs w:val="false"/>
+          <w:sz w:val="24"/>
+          <w:szCs w:val="24"/>
+          <w:rtl/>
+        </w:rPr>
+        <w:t xml:space="preserve">נסרין: </w:t>
+      </w:r>
+      <w:r>
+        <w:rPr>
+          <w:noProof/>
+          <w:rFonts w:ascii="Times New Roman" w:cs="David" w:eastAsia="David" w:hAnsi="Times New Roman"/>
+          <w:b w:val="false"/>
+          <w:bCs w:val="false"/>
+          <w:i/>
+          <w:iCs/>
+          <w:sz w:val="24"/>
+          <w:szCs w:val="24"/>
+          <w:rtl/>
+        </w:rPr>
+        <w:t xml:space="preserve">ומה היית אומר לרוקחים, לא כמנהל, כעמית?</w:t>
+      </w:r>
+    </w:p>
+    <w:p>
+      <w:pPr>
+        <w:keepNext w:val="false"/>
+        <w:bidi/>
+        <w:spacing w:after="80" w:line="360"/>
+        <w:jc w:val="both"/>
+      </w:pPr>
+      <w:r>
+        <w:rPr>
+          <w:noProof/>
+          <w:rFonts w:ascii="Times New Roman" w:cs="David" w:eastAsia="David" w:hAnsi="Times New Roman"/>
+          <w:b/>
+          <w:bCs/>
+          <w:i w:val="false"/>
+          <w:iCs w:val="false"/>
+          <w:sz w:val="24"/>
+          <w:szCs w:val="24"/>
+          <w:rtl/>
+        </w:rPr>
+        <w:t xml:space="preserve">ר': </w:t>
+      </w:r>
+      <w:r>
+        <w:rPr>
+          <w:noProof/>
+          <w:rFonts w:ascii="Times New Roman" w:cs="David" w:eastAsia="David" w:hAnsi="Times New Roman"/>
+          <w:b w:val="false"/>
+          <w:bCs w:val="false"/>
+          <w:i/>
+          <w:iCs/>
+          <w:sz w:val="24"/>
+          <w:szCs w:val="24"/>
+          <w:rtl/>
+        </w:rPr>
+        <w:t xml:space="preserve">… הייתי אומר שני דברים שסותרים. תשתמשו, כי זה עוזר, ובערבית זה עוזר במיוחד. ואל תאמינו, לשום מספר, אף פעם. ושאם שני הדברים האלה מרגישים להם סותרים, זה בסדר. זה בדיוק המקצוע עכשיו: להחזיק כלי שעוזר ולא לסמוך עליו. … והייתי אומר להם לדבר. לספר על ה"כמעט". כי כל אחד מאיתנו יש לו "כמעט", ואם כולם שותקים, כל אחד לומד לבד, ומישהו בסוף לא ילמד בזמן.</w:t>
       </w:r>
     </w:p>
     <w:p>

</xml_diff>